<commit_message>
docs+prototype: PRD v0.3 review and clickable prototype v2
- PRD v0.3 after prd-development review: studio = scene + model, shared
  scene sync, 200-image quota, failure/retake rules, delete blocking,
  self-photo model, outer Agent as P1, fidelity spot-check acceptance
- Prototype v2 rebuilt from scratch (taste skill direction, impeccable
  build): source split under 原型-临时/src, merged by build.sh; demo
  account by default; artifact build via build-artifact.py
- DESIGN.md / design.json, review screenshots, decision log D48-D61,
  AGENTS.md reorganized

Co-Authored-By: Claude Opus 5.5 <noreply@anthropic.com>
</commit_message>
<xml_diff>
--- a/PRD/PRD-合伙人投资人版.docx
+++ b/PRD/PRD-合伙人投资人版.docx
@@ -1255,7 +1255,7 @@
         <w:rPr>
           <w:rFonts w:hint="eastAsia"/>
         </w:rPr>
-        <w:t xml:space="preserve">与饰品三视图一起组建工作室</w:t>
+        <w:t xml:space="preserve">组建工作室</w:t>
       </w:r>
       <w:r>
         <w:t xml:space="preserve"> → </w:t>
@@ -1315,7 +1315,7 @@
         <w:rPr>
           <w:rFonts w:hint="eastAsia"/>
         </w:rPr>
-        <w:t xml:space="preserve">：场景、模特、饰品、店铺参考都是用户的资产；调性相近的作品复用同一间，风格不同就新建；工作室里的模特、场景随时可以切换。</w:t>
+        <w:t xml:space="preserve">：场景、模特、饰品、店铺参考都是用户的资产；调性相近的作品复用同一间，风格不同就新建；工作室里的模特、场景随时可以切换。模特可从预置库挑、对话生成，也可以用卖家本人的照片（单独授权、只自己可用）。</w:t>
       </w:r>
       <w:r>
         <w:t xml:space="preserve"> </w:t>
@@ -1450,7 +1450,16 @@
         <w:rPr>
           <w:rFonts w:hint="eastAsia"/>
         </w:rPr>
-        <w:t xml:space="preserve">说”帮这条银项链建一间清冷风的工作室”或”用上次那间海边工作室拍这对耳环”，由它调用工作流完成创建或复用，关键处（设定卡、保存工作室）请你确认。</w:t>
+        <w:t xml:space="preserve">说”帮这条银项链建一间清冷风的工作室”或”用上次那间海边工作室拍这对耳环”，由它调用工作流完成创建或复用，关键处（设定卡、保存工作室）请你确认。Agent</w:t>
+      </w:r>
+      <w:r>
+        <w:t xml:space="preserve"> </w:t>
+      </w:r>
+      <w:r>
+        <w:rPr>
+          <w:rFonts w:hint="eastAsia"/>
+        </w:rPr>
+        <w:t xml:space="preserve">排在页面核心流程跑通之后上线。</w:t>
       </w:r>
       <w:r>
         <w:t xml:space="preserve"> </w:t>
@@ -1501,7 +1510,16 @@
         <w:rPr>
           <w:rFonts w:hint="eastAsia"/>
         </w:rPr>
-        <w:t xml:space="preserve">：项链、手链、耳饰；电脑浏览器网站；中文、国内平台；实验期免费；只做下载导出。</w:t>
+        <w:t xml:space="preserve">：项链、手链、耳饰；电脑浏览器网站；中文、国内平台；实验期免费（每人</w:t>
+      </w:r>
+      <w:r>
+        <w:t xml:space="preserve"> 200 </w:t>
+      </w:r>
+      <w:r>
+        <w:rPr>
+          <w:rFonts w:hint="eastAsia"/>
+        </w:rPr>
+        <w:t xml:space="preserve">张生成额度，控制成本）；只做下载导出。</w:t>
       </w:r>
     </w:p>
     <w:p>

</xml_diff>